<commit_message>
BUILD6 production: finalize rebrand and 16-week assignments repair
</commit_message>
<xml_diff>
--- a/protected-resources/ambassador/week-09/Future-Ready-Week-09-Activity-Kit.docx
+++ b/protected-resources/ambassador/week-09/Future-Ready-Week-09-Activity-Kit.docx
@@ -8,19 +8,11 @@
       </w:pPr>
       <w:r>
         <w:rPr>
+          <w:rFonts w:ascii="Aptos Display" w:hAnsi="Aptos Display"/>
           <w:b/>
-          <w:sz w:val="30"/>
+          <w:sz w:val="48"/>
         </w:rPr>
-        <w:t>BUILD6™ — Ambassador Christian School</w:t>
-      </w:r>
-    </w:p>
-    <w:p>
-      <w:pPr>
-        <w:pStyle w:val="Heading1"/>
-        <w:jc w:val="center"/>
-      </w:pPr>
-      <w:r>
-        <w:t>Week 9: Jennifer Miller - Resume Story Bank</w:t>
+        <w:t>BUILD6™</w:t>
       </w:r>
     </w:p>
     <w:p>
@@ -30,23 +22,52 @@
       <w:r>
         <w:rPr>
           <w:b/>
+          <w:sz w:val="34"/>
         </w:rPr>
-        <w:t>Activity Kit</w:t>
+        <w:t>WEEK 9 · AI at Work</w:t>
+      </w:r>
+    </w:p>
+    <w:p>
+      <w:pPr>
+        <w:jc w:val="center"/>
+      </w:pPr>
+      <w:r>
+        <w:rPr>
+          <w:i/>
+          <w:sz w:val="22"/>
+        </w:rPr>
+        <w:t>Think Better. Work Smarter. Stay Human.</w:t>
+      </w:r>
+    </w:p>
+    <w:p>
+      <w:pPr>
+        <w:jc w:val="center"/>
+      </w:pPr>
+      <w:r>
+        <w:rPr>
+          <w:b/>
+          <w:sz w:val="18"/>
+        </w:rPr>
+        <w:t>ACTIVITY KIT / ADD-ONS / TOOLKIT</w:t>
+      </w:r>
+    </w:p>
+    <w:p/>
+    <w:p>
+      <w:r>
+        <w:t>Use these as modular add-ons. Coach Jones may run one full activity or combine short rounds. Keep students moving, speaking, deciding, practicing and retrying.</w:t>
+      </w:r>
+    </w:p>
+    <w:p>
+      <w:pPr>
+        <w:pStyle w:val="Heading1"/>
+      </w:pPr>
+      <w:r>
+        <w:t>ACTIVITY 1 · Would You Trust It?</w:t>
       </w:r>
     </w:p>
     <w:p>
       <w:r>
-        <w:t>Date: October 15, 2026</w:t>
-      </w:r>
-    </w:p>
-    <w:p>
-      <w:r>
-        <w:t>BUILD6 Stage: CONNECT™</w:t>
-      </w:r>
-    </w:p>
-    <w:p>
-      <w:r>
-        <w:t>Experience Alignment: Jennifer Miller session. Resume stories, mock interview preparation and professional self-presentation.</w:t>
+        <w:t>Students move to YES / NO / IT DEPENDS for AI-use scenarios and defend the conditions required before trusting the output.</w:t>
       </w:r>
     </w:p>
     <w:p>
@@ -54,7 +75,7 @@
         <w:pStyle w:val="Heading2"/>
       </w:pPr>
       <w:r>
-        <w:t>Activity Options</w:t>
+        <w:t>Run It</w:t>
       </w:r>
     </w:p>
     <w:p>
@@ -62,7 +83,7 @@
         <w:pStyle w:val="ListBullet"/>
       </w:pPr>
       <w:r>
-        <w:t>Pair-share: one real question I should ask this week.</w:t>
+        <w:t>Explain the situation and success target in under 90 seconds.</w:t>
       </w:r>
     </w:p>
     <w:p>
@@ -70,7 +91,7 @@
         <w:pStyle w:val="ListBullet"/>
       </w:pPr>
       <w:r>
-        <w:t>Small-group challenge: connect the experience to a BUILD6 skill.</w:t>
+        <w:t>Put students into pairs or teams and assign roles when useful.</w:t>
       </w:r>
     </w:p>
     <w:p>
@@ -78,7 +99,7 @@
         <w:pStyle w:val="ListBullet"/>
       </w:pPr>
       <w:r>
-        <w:t>Role-play: professional communication under pressure.</w:t>
+        <w:t>Run the first attempt quickly - do not overcoach before students try.</w:t>
       </w:r>
     </w:p>
     <w:p>
@@ -86,7 +107,7 @@
         <w:pStyle w:val="ListBullet"/>
       </w:pPr>
       <w:r>
-        <w:t>Evidence capture: choose one moment worth saving for the Capstone.</w:t>
+        <w:t>Stop and ask one observation question.</w:t>
       </w:r>
     </w:p>
     <w:p>
@@ -94,7 +115,23 @@
         <w:pStyle w:val="ListBullet"/>
       </w:pPr>
       <w:r>
-        <w:t>Exit ticket: one thing I learned about who I am becoming.</w:t>
+        <w:t>Give one precise coaching point or introduce a curveball.</w:t>
+      </w:r>
+    </w:p>
+    <w:p>
+      <w:pPr>
+        <w:pStyle w:val="ListBullet"/>
+      </w:pPr>
+      <w:r>
+        <w:t>Retry immediately.</w:t>
+      </w:r>
+    </w:p>
+    <w:p>
+      <w:pPr>
+        <w:pStyle w:val="ListBullet"/>
+      </w:pPr>
+      <w:r>
+        <w:t>Debrief by connecting the activity to a real workplace, interview, project, customer, team or professional relationship.</w:t>
       </w:r>
     </w:p>
     <w:p>
@@ -102,2416 +139,497 @@
         <w:pStyle w:val="Heading2"/>
       </w:pPr>
       <w:r>
-        <w:t>Locked Weekly Curriculum</w:t>
+        <w:t>Evidence to Capture</w:t>
+      </w:r>
+    </w:p>
+    <w:p>
+      <w:pPr>
+        <w:pStyle w:val="ListBullet"/>
+      </w:pPr>
+      <w:r>
+        <w:t>What did I notice about the difference between getting an AI answer and making a professional decision?</w:t>
+      </w:r>
+    </w:p>
+    <w:p>
+      <w:pPr>
+        <w:pStyle w:val="ListBullet"/>
+      </w:pPr>
+      <w:r>
+        <w:t>AI Verification Checklist + Human/AI Project Evidence + Professional AI Rules</w:t>
+      </w:r>
+    </w:p>
+    <w:p>
+      <w:pPr>
+        <w:pStyle w:val="ListBullet"/>
+      </w:pPr>
+      <w:r>
+        <w:t>Preserve one example showing how you used judgment: the original AI output, what you changed or rejected, what you verified, and why your final decision was better.</w:t>
       </w:r>
     </w:p>
     <w:p>
       <w:r>
-        <w:t>© 2026 BUILD6™. All Rights Reserved.</w:t>
+        <w:br w:type="page"/>
+      </w:r>
+    </w:p>
+    <w:p>
+      <w:pPr>
+        <w:pStyle w:val="Heading1"/>
+      </w:pPr>
+      <w:r>
+        <w:t>ACTIVITY 2 · Prompt Makeover Relay</w:t>
       </w:r>
     </w:p>
     <w:p>
       <w:r>
-        <w:t>Proprietary Future Ready™ / BUILD6™ program material.</w:t>
+        <w:t>Teams transform vague prompts into professional prompts with role, context, goal, audience, constraints and format.</w:t>
+      </w:r>
+    </w:p>
+    <w:p>
+      <w:pPr>
+        <w:pStyle w:val="Heading2"/>
+      </w:pPr>
+      <w:r>
+        <w:t>Run It</w:t>
+      </w:r>
+    </w:p>
+    <w:p>
+      <w:pPr>
+        <w:pStyle w:val="ListBullet"/>
+      </w:pPr>
+      <w:r>
+        <w:t>Explain the situation and success target in under 90 seconds.</w:t>
+      </w:r>
+    </w:p>
+    <w:p>
+      <w:pPr>
+        <w:pStyle w:val="ListBullet"/>
+      </w:pPr>
+      <w:r>
+        <w:t>Put students into pairs or teams and assign roles when useful.</w:t>
+      </w:r>
+    </w:p>
+    <w:p>
+      <w:pPr>
+        <w:pStyle w:val="ListBullet"/>
+      </w:pPr>
+      <w:r>
+        <w:t>Run the first attempt quickly - do not overcoach before students try.</w:t>
+      </w:r>
+    </w:p>
+    <w:p>
+      <w:pPr>
+        <w:pStyle w:val="ListBullet"/>
+      </w:pPr>
+      <w:r>
+        <w:t>Stop and ask one observation question.</w:t>
+      </w:r>
+    </w:p>
+    <w:p>
+      <w:pPr>
+        <w:pStyle w:val="ListBullet"/>
+      </w:pPr>
+      <w:r>
+        <w:t>Give one precise coaching point or introduce a curveball.</w:t>
+      </w:r>
+    </w:p>
+    <w:p>
+      <w:pPr>
+        <w:pStyle w:val="ListBullet"/>
+      </w:pPr>
+      <w:r>
+        <w:t>Retry immediately.</w:t>
+      </w:r>
+    </w:p>
+    <w:p>
+      <w:pPr>
+        <w:pStyle w:val="ListBullet"/>
+      </w:pPr>
+      <w:r>
+        <w:t>Debrief by connecting the activity to a real workplace, interview, project, customer, team or professional relationship.</w:t>
+      </w:r>
+    </w:p>
+    <w:p>
+      <w:pPr>
+        <w:pStyle w:val="Heading2"/>
+      </w:pPr>
+      <w:r>
+        <w:t>Evidence to Capture</w:t>
+      </w:r>
+    </w:p>
+    <w:p>
+      <w:pPr>
+        <w:pStyle w:val="ListBullet"/>
+      </w:pPr>
+      <w:r>
+        <w:t>What did I notice about the difference between getting an AI answer and making a professional decision?</w:t>
+      </w:r>
+    </w:p>
+    <w:p>
+      <w:pPr>
+        <w:pStyle w:val="ListBullet"/>
+      </w:pPr>
+      <w:r>
+        <w:t>AI Verification Checklist + Human/AI Project Evidence + Professional AI Rules</w:t>
+      </w:r>
+    </w:p>
+    <w:p>
+      <w:pPr>
+        <w:pStyle w:val="ListBullet"/>
+      </w:pPr>
+      <w:r>
+        <w:t>Preserve one example showing how you used judgment: the original AI output, what you changed or rejected, what you verified, and why your final decision was better.</w:t>
       </w:r>
     </w:p>
     <w:p>
       <w:r>
-        <w:t>Future Ready™ · Week 9</w:t>
+        <w:br w:type="page"/>
+      </w:r>
+    </w:p>
+    <w:p>
+      <w:pPr>
+        <w:pStyle w:val="Heading1"/>
+      </w:pPr>
+      <w:r>
+        <w:t>ACTIVITY 3 · AI Detective</w:t>
       </w:r>
     </w:p>
     <w:p>
       <w:r>
-        <w:t>RESUME STORY BANK + JENNIFER MILLER PREP</w:t>
+        <w:t>Teams critique flawed AI answers for unsupported claims, privacy risks, bias, missing context and overconfidence.</w:t>
+      </w:r>
+    </w:p>
+    <w:p>
+      <w:pPr>
+        <w:pStyle w:val="Heading2"/>
+      </w:pPr>
+      <w:r>
+        <w:t>Run It</w:t>
+      </w:r>
+    </w:p>
+    <w:p>
+      <w:pPr>
+        <w:pStyle w:val="ListBullet"/>
+      </w:pPr>
+      <w:r>
+        <w:t>Explain the situation and success target in under 90 seconds.</w:t>
+      </w:r>
+    </w:p>
+    <w:p>
+      <w:pPr>
+        <w:pStyle w:val="ListBullet"/>
+      </w:pPr>
+      <w:r>
+        <w:t>Put students into pairs or teams and assign roles when useful.</w:t>
+      </w:r>
+    </w:p>
+    <w:p>
+      <w:pPr>
+        <w:pStyle w:val="ListBullet"/>
+      </w:pPr>
+      <w:r>
+        <w:t>Run the first attempt quickly - do not overcoach before students try.</w:t>
+      </w:r>
+    </w:p>
+    <w:p>
+      <w:pPr>
+        <w:pStyle w:val="ListBullet"/>
+      </w:pPr>
+      <w:r>
+        <w:t>Stop and ask one observation question.</w:t>
+      </w:r>
+    </w:p>
+    <w:p>
+      <w:pPr>
+        <w:pStyle w:val="ListBullet"/>
+      </w:pPr>
+      <w:r>
+        <w:t>Give one precise coaching point or introduce a curveball.</w:t>
+      </w:r>
+    </w:p>
+    <w:p>
+      <w:pPr>
+        <w:pStyle w:val="ListBullet"/>
+      </w:pPr>
+      <w:r>
+        <w:t>Retry immediately.</w:t>
+      </w:r>
+    </w:p>
+    <w:p>
+      <w:pPr>
+        <w:pStyle w:val="ListBullet"/>
+      </w:pPr>
+      <w:r>
+        <w:t>Debrief by connecting the activity to a real workplace, interview, project, customer, team or professional relationship.</w:t>
+      </w:r>
+    </w:p>
+    <w:p>
+      <w:pPr>
+        <w:pStyle w:val="Heading2"/>
+      </w:pPr>
+      <w:r>
+        <w:t>Evidence to Capture</w:t>
+      </w:r>
+    </w:p>
+    <w:p>
+      <w:pPr>
+        <w:pStyle w:val="ListBullet"/>
+      </w:pPr>
+      <w:r>
+        <w:t>What did I notice about the difference between getting an AI answer and making a professional decision?</w:t>
+      </w:r>
+    </w:p>
+    <w:p>
+      <w:pPr>
+        <w:pStyle w:val="ListBullet"/>
+      </w:pPr>
+      <w:r>
+        <w:t>AI Verification Checklist + Human/AI Project Evidence + Professional AI Rules</w:t>
+      </w:r>
+    </w:p>
+    <w:p>
+      <w:pPr>
+        <w:pStyle w:val="ListBullet"/>
+      </w:pPr>
+      <w:r>
+        <w:t>Preserve one example showing how you used judgment: the original AI output, what you changed or rejected, what you verified, and why your final decision was better.</w:t>
       </w:r>
     </w:p>
     <w:p>
       <w:r>
-        <w:t>Evidence · Resume Development · Personal Brand · Professional Communication</w:t>
+        <w:br w:type="page"/>
+      </w:r>
+    </w:p>
+    <w:p>
+      <w:pPr>
+        <w:pStyle w:val="Heading1"/>
+      </w:pPr>
+      <w:r>
+        <w:t>ACTIVITY 4 · Truth, Maybe, or Nope</w:t>
       </w:r>
     </w:p>
     <w:p>
       <w:r>
-        <w:t>ESSENTIAL QUESTION</w:t>
+        <w:t>Teams classify AI output as Trust / Verify / Reject and explain why.</w:t>
+      </w:r>
+    </w:p>
+    <w:p>
+      <w:pPr>
+        <w:pStyle w:val="Heading2"/>
+      </w:pPr>
+      <w:r>
+        <w:t>Run It</w:t>
+      </w:r>
+    </w:p>
+    <w:p>
+      <w:pPr>
+        <w:pStyle w:val="ListBullet"/>
+      </w:pPr>
+      <w:r>
+        <w:t>Explain the situation and success target in under 90 seconds.</w:t>
+      </w:r>
+    </w:p>
+    <w:p>
+      <w:pPr>
+        <w:pStyle w:val="ListBullet"/>
+      </w:pPr>
+      <w:r>
+        <w:t>Put students into pairs or teams and assign roles when useful.</w:t>
+      </w:r>
+    </w:p>
+    <w:p>
+      <w:pPr>
+        <w:pStyle w:val="ListBullet"/>
+      </w:pPr>
+      <w:r>
+        <w:t>Run the first attempt quickly - do not overcoach before students try.</w:t>
+      </w:r>
+    </w:p>
+    <w:p>
+      <w:pPr>
+        <w:pStyle w:val="ListBullet"/>
+      </w:pPr>
+      <w:r>
+        <w:t>Stop and ask one observation question.</w:t>
+      </w:r>
+    </w:p>
+    <w:p>
+      <w:pPr>
+        <w:pStyle w:val="ListBullet"/>
+      </w:pPr>
+      <w:r>
+        <w:t>Give one precise coaching point or introduce a curveball.</w:t>
+      </w:r>
+    </w:p>
+    <w:p>
+      <w:pPr>
+        <w:pStyle w:val="ListBullet"/>
+      </w:pPr>
+      <w:r>
+        <w:t>Retry immediately.</w:t>
+      </w:r>
+    </w:p>
+    <w:p>
+      <w:pPr>
+        <w:pStyle w:val="ListBullet"/>
+      </w:pPr>
+      <w:r>
+        <w:t>Debrief by connecting the activity to a real workplace, interview, project, customer, team or professional relationship.</w:t>
+      </w:r>
+    </w:p>
+    <w:p>
+      <w:pPr>
+        <w:pStyle w:val="Heading2"/>
+      </w:pPr>
+      <w:r>
+        <w:t>Evidence to Capture</w:t>
+      </w:r>
+    </w:p>
+    <w:p>
+      <w:pPr>
+        <w:pStyle w:val="ListBullet"/>
+      </w:pPr>
+      <w:r>
+        <w:t>What did I notice about the difference between getting an AI answer and making a professional decision?</w:t>
+      </w:r>
+    </w:p>
+    <w:p>
+      <w:pPr>
+        <w:pStyle w:val="ListBullet"/>
+      </w:pPr>
+      <w:r>
+        <w:t>AI Verification Checklist + Human/AI Project Evidence + Professional AI Rules</w:t>
+      </w:r>
+    </w:p>
+    <w:p>
+      <w:pPr>
+        <w:pStyle w:val="ListBullet"/>
+      </w:pPr>
+      <w:r>
+        <w:t>Preserve one example showing how you used judgment: the original AI output, what you changed or rejected, what you verified, and why your final decision was better.</w:t>
       </w:r>
     </w:p>
     <w:p>
       <w:r>
-        <w:t>**How do I prove what I can do instead of simply saying what I am?**</w:t>
+        <w:br w:type="page"/>
+      </w:r>
+    </w:p>
+    <w:p>
+      <w:pPr>
+        <w:pStyle w:val="Heading1"/>
+      </w:pPr>
+      <w:r>
+        <w:t>ACTIVITY 5 · Human + AI Project Studio</w:t>
       </w:r>
     </w:p>
     <w:p>
       <w:r>
-        <w:t>---</w:t>
+        <w:t>Students improve a real project while documenting what AI did and what they personally changed, verified and owned.</w:t>
       </w:r>
     </w:p>
     <w:p>
+      <w:pPr>
+        <w:pStyle w:val="Heading2"/>
+      </w:pPr>
       <w:r>
-        <w:t>THIS WEEK</w:t>
+        <w:t>Run It</w:t>
       </w:r>
     </w:p>
     <w:p>
+      <w:pPr>
+        <w:pStyle w:val="ListBullet"/>
+      </w:pPr>
       <w:r>
-        <w:t>You have already built evidence.</w:t>
+        <w:t>Explain the situation and success target in under 90 seconds.</w:t>
       </w:r>
     </w:p>
     <w:p>
+      <w:pPr>
+        <w:pStyle w:val="ListBullet"/>
+      </w:pPr>
       <w:r>
-        <w:t>You have:</w:t>
+        <w:t>Put students into pairs or teams and assign roles when useful.</w:t>
       </w:r>
     </w:p>
     <w:p>
+      <w:pPr>
+        <w:pStyle w:val="ListBullet"/>
+      </w:pPr>
       <w:r>
-        <w:t>- explored careers</w:t>
-        <w:br/>
-        <w:t>- made financial decisions</w:t>
-        <w:br/>
-        <w:t>- asked professionals real questions</w:t>
-        <w:br/>
-        <w:t>- observed workplace systems</w:t>
-        <w:br/>
-        <w:t>- identified technical and human skills</w:t>
-        <w:br/>
-        <w:t>- practiced professionalism</w:t>
-        <w:br/>
-        <w:t>- reflected on what you learned</w:t>
+        <w:t>Run the first attempt quickly - do not overcoach before students try.</w:t>
       </w:r>
     </w:p>
     <w:p>
+      <w:pPr>
+        <w:pStyle w:val="ListBullet"/>
+      </w:pPr>
       <w:r>
-        <w:t>Now the challenge is turning those experiences into language employers can understand.</w:t>
+        <w:t>Stop and ask one observation question.</w:t>
       </w:r>
     </w:p>
     <w:p>
+      <w:pPr>
+        <w:pStyle w:val="ListBullet"/>
+      </w:pPr>
       <w:r>
-        <w:t>A strong resume does not simply say:</w:t>
+        <w:t>Give one precise coaching point or introduce a curveball.</w:t>
       </w:r>
     </w:p>
     <w:p>
+      <w:pPr>
+        <w:pStyle w:val="ListBullet"/>
+      </w:pPr>
       <w:r>
-        <w:t>- hardworking</w:t>
-        <w:br/>
-        <w:t>- leader</w:t>
-        <w:br/>
-        <w:t>- responsible</w:t>
-        <w:br/>
-        <w:t>- team player</w:t>
-        <w:br/>
-        <w:t>- good communicator</w:t>
+        <w:t>Retry immediately.</w:t>
       </w:r>
     </w:p>
     <w:p>
+      <w:pPr>
+        <w:pStyle w:val="ListBullet"/>
+      </w:pPr>
       <w:r>
-        <w:t>It proves those qualities through evidence.</w:t>
+        <w:t>Debrief by connecting the activity to a real workplace, interview, project, customer, team or professional relationship.</w:t>
       </w:r>
     </w:p>
     <w:p>
+      <w:pPr>
+        <w:pStyle w:val="Heading2"/>
+      </w:pPr>
       <w:r>
-        <w:t>---</w:t>
+        <w:t>Evidence to Capture</w:t>
       </w:r>
     </w:p>
     <w:p>
+      <w:pPr>
+        <w:pStyle w:val="ListBullet"/>
+      </w:pPr>
       <w:r>
-        <w:t>PART 1 · START WITH THE EXPERIENCES</w:t>
+        <w:t>What did I notice about the difference between getting an AI answer and making a professional decision?</w:t>
       </w:r>
     </w:p>
     <w:p>
+      <w:pPr>
+        <w:pStyle w:val="ListBullet"/>
+      </w:pPr>
       <w:r>
-        <w:t>List experiences from school, athletics, work, family responsibilities, volunteering, clubs, projects and Future Ready™.</w:t>
+        <w:t>AI Verification Checklist + Human/AI Project Evidence + Professional AI Rules</w:t>
       </w:r>
     </w:p>
     <w:p>
+      <w:pPr>
+        <w:pStyle w:val="ListBullet"/>
+      </w:pPr>
       <w:r>
-        <w:t>EXPERIENCE 1</w:t>
-      </w:r>
-    </w:p>
-    <w:p>
-      <w:r>
-        <w:t>Experience:</w:t>
-      </w:r>
-    </w:p>
-    <w:p>
-      <w:r>
-        <w:t>____________________________________________________</w:t>
-      </w:r>
-    </w:p>
-    <w:p>
-      <w:r>
-        <w:t>What happened?</w:t>
-      </w:r>
-    </w:p>
-    <w:p>
-      <w:r>
-        <w:t>____________________________________________________</w:t>
-      </w:r>
-    </w:p>
-    <w:p>
-      <w:r>
-        <w:t>____________________________________________________</w:t>
-      </w:r>
-    </w:p>
-    <w:p>
-      <w:r>
-        <w:t>What did I actually do?</w:t>
-      </w:r>
-    </w:p>
-    <w:p>
-      <w:r>
-        <w:t>____________________________________________________</w:t>
-      </w:r>
-    </w:p>
-    <w:p>
-      <w:r>
-        <w:t>____________________________________________________</w:t>
-      </w:r>
-    </w:p>
-    <w:p>
-      <w:r>
-        <w:t>What skill did I use?</w:t>
-      </w:r>
-    </w:p>
-    <w:p>
-      <w:r>
-        <w:t>____________________________________________________</w:t>
-      </w:r>
-    </w:p>
-    <w:p>
-      <w:r>
-        <w:t>What was the result?</w:t>
-      </w:r>
-    </w:p>
-    <w:p>
-      <w:r>
-        <w:t>____________________________________________________</w:t>
-      </w:r>
-    </w:p>
-    <w:p>
-      <w:r>
-        <w:t>____________________________________________________</w:t>
-      </w:r>
-    </w:p>
-    <w:p>
-      <w:r>
-        <w:t>---</w:t>
-      </w:r>
-    </w:p>
-    <w:p>
-      <w:r>
-        <w:t>EXPERIENCE 2</w:t>
-      </w:r>
-    </w:p>
-    <w:p>
-      <w:r>
-        <w:t>Experience:</w:t>
-      </w:r>
-    </w:p>
-    <w:p>
-      <w:r>
-        <w:t>____________________________________________________</w:t>
-      </w:r>
-    </w:p>
-    <w:p>
-      <w:r>
-        <w:t>What happened?</w:t>
-      </w:r>
-    </w:p>
-    <w:p>
-      <w:r>
-        <w:t>____________________________________________________</w:t>
-      </w:r>
-    </w:p>
-    <w:p>
-      <w:r>
-        <w:t>____________________________________________________</w:t>
-      </w:r>
-    </w:p>
-    <w:p>
-      <w:r>
-        <w:t>What did I actually do?</w:t>
-      </w:r>
-    </w:p>
-    <w:p>
-      <w:r>
-        <w:t>____________________________________________________</w:t>
-      </w:r>
-    </w:p>
-    <w:p>
-      <w:r>
-        <w:t>____________________________________________________</w:t>
-      </w:r>
-    </w:p>
-    <w:p>
-      <w:r>
-        <w:t>What skill did I use?</w:t>
-      </w:r>
-    </w:p>
-    <w:p>
-      <w:r>
-        <w:t>____________________________________________________</w:t>
-      </w:r>
-    </w:p>
-    <w:p>
-      <w:r>
-        <w:t>What was the result?</w:t>
-      </w:r>
-    </w:p>
-    <w:p>
-      <w:r>
-        <w:t>____________________________________________________</w:t>
-      </w:r>
-    </w:p>
-    <w:p>
-      <w:r>
-        <w:t>____________________________________________________</w:t>
-      </w:r>
-    </w:p>
-    <w:p>
-      <w:r>
-        <w:t>---</w:t>
-      </w:r>
-    </w:p>
-    <w:p>
-      <w:r>
-        <w:t>EXPERIENCE 3</w:t>
-      </w:r>
-    </w:p>
-    <w:p>
-      <w:r>
-        <w:t>Experience:</w:t>
-      </w:r>
-    </w:p>
-    <w:p>
-      <w:r>
-        <w:t>____________________________________________________</w:t>
-      </w:r>
-    </w:p>
-    <w:p>
-      <w:r>
-        <w:t>What happened?</w:t>
-      </w:r>
-    </w:p>
-    <w:p>
-      <w:r>
-        <w:t>____________________________________________________</w:t>
-      </w:r>
-    </w:p>
-    <w:p>
-      <w:r>
-        <w:t>____________________________________________________</w:t>
-      </w:r>
-    </w:p>
-    <w:p>
-      <w:r>
-        <w:t>What did I actually do?</w:t>
-      </w:r>
-    </w:p>
-    <w:p>
-      <w:r>
-        <w:t>____________________________________________________</w:t>
-      </w:r>
-    </w:p>
-    <w:p>
-      <w:r>
-        <w:t>____________________________________________________</w:t>
-      </w:r>
-    </w:p>
-    <w:p>
-      <w:r>
-        <w:t>What skill did I use?</w:t>
-      </w:r>
-    </w:p>
-    <w:p>
-      <w:r>
-        <w:t>____________________________________________________</w:t>
-      </w:r>
-    </w:p>
-    <w:p>
-      <w:r>
-        <w:t>What was the result?</w:t>
-      </w:r>
-    </w:p>
-    <w:p>
-      <w:r>
-        <w:t>____________________________________________________</w:t>
-      </w:r>
-    </w:p>
-    <w:p>
-      <w:r>
-        <w:t>____________________________________________________</w:t>
-      </w:r>
-    </w:p>
-    <w:p>
-      <w:r>
-        <w:t>---</w:t>
-      </w:r>
-    </w:p>
-    <w:p>
-      <w:r>
-        <w:t>EXPERIENCE 4</w:t>
-      </w:r>
-    </w:p>
-    <w:p>
-      <w:r>
-        <w:t>Experience:</w:t>
-      </w:r>
-    </w:p>
-    <w:p>
-      <w:r>
-        <w:t>____________________________________________________</w:t>
-      </w:r>
-    </w:p>
-    <w:p>
-      <w:r>
-        <w:t>What happened?</w:t>
-      </w:r>
-    </w:p>
-    <w:p>
-      <w:r>
-        <w:t>____________________________________________________</w:t>
-      </w:r>
-    </w:p>
-    <w:p>
-      <w:r>
-        <w:t>____________________________________________________</w:t>
-      </w:r>
-    </w:p>
-    <w:p>
-      <w:r>
-        <w:t>What did I actually do?</w:t>
-      </w:r>
-    </w:p>
-    <w:p>
-      <w:r>
-        <w:t>____________________________________________________</w:t>
-      </w:r>
-    </w:p>
-    <w:p>
-      <w:r>
-        <w:t>____________________________________________________</w:t>
-      </w:r>
-    </w:p>
-    <w:p>
-      <w:r>
-        <w:t>What skill did I use?</w:t>
-      </w:r>
-    </w:p>
-    <w:p>
-      <w:r>
-        <w:t>____________________________________________________</w:t>
-      </w:r>
-    </w:p>
-    <w:p>
-      <w:r>
-        <w:t>What was the result?</w:t>
-      </w:r>
-    </w:p>
-    <w:p>
-      <w:r>
-        <w:t>____________________________________________________</w:t>
-      </w:r>
-    </w:p>
-    <w:p>
-      <w:r>
-        <w:t>____________________________________________________</w:t>
-      </w:r>
-    </w:p>
-    <w:p>
-      <w:r>
-        <w:t>---</w:t>
-      </w:r>
-    </w:p>
-    <w:p>
-      <w:r>
-        <w:t>EXPERIENCE 5</w:t>
-      </w:r>
-    </w:p>
-    <w:p>
-      <w:r>
-        <w:t>Experience:</w:t>
-      </w:r>
-    </w:p>
-    <w:p>
-      <w:r>
-        <w:t>____________________________________________________</w:t>
-      </w:r>
-    </w:p>
-    <w:p>
-      <w:r>
-        <w:t>What happened?</w:t>
-      </w:r>
-    </w:p>
-    <w:p>
-      <w:r>
-        <w:t>____________________________________________________</w:t>
-      </w:r>
-    </w:p>
-    <w:p>
-      <w:r>
-        <w:t>____________________________________________________</w:t>
-      </w:r>
-    </w:p>
-    <w:p>
-      <w:r>
-        <w:t>What did I actually do?</w:t>
-      </w:r>
-    </w:p>
-    <w:p>
-      <w:r>
-        <w:t>____________________________________________________</w:t>
-      </w:r>
-    </w:p>
-    <w:p>
-      <w:r>
-        <w:t>____________________________________________________</w:t>
-      </w:r>
-    </w:p>
-    <w:p>
-      <w:r>
-        <w:t>What skill did I use?</w:t>
-      </w:r>
-    </w:p>
-    <w:p>
-      <w:r>
-        <w:t>____________________________________________________</w:t>
-      </w:r>
-    </w:p>
-    <w:p>
-      <w:r>
-        <w:t>What was the result?</w:t>
-      </w:r>
-    </w:p>
-    <w:p>
-      <w:r>
-        <w:t>____________________________________________________</w:t>
-      </w:r>
-    </w:p>
-    <w:p>
-      <w:r>
-        <w:t>____________________________________________________</w:t>
-      </w:r>
-    </w:p>
-    <w:p>
-      <w:r>
-        <w:t>---</w:t>
-      </w:r>
-    </w:p>
-    <w:p>
-      <w:r>
-        <w:t>PART 2 · FUTURE READY™ EVIDENCE</w:t>
-      </w:r>
-    </w:p>
-    <w:p>
-      <w:r>
-        <w:t>Think specifically about recent weeks.</w:t>
-      </w:r>
-    </w:p>
-    <w:p>
-      <w:r>
-        <w:t>WEEK 4 · SEG SYSTEMS</w:t>
-      </w:r>
-    </w:p>
-    <w:p>
-      <w:r>
-        <w:t>Something I observed or practiced:</w:t>
-      </w:r>
-    </w:p>
-    <w:p>
-      <w:r>
-        <w:t>____________________________________________________</w:t>
-      </w:r>
-    </w:p>
-    <w:p>
-      <w:r>
-        <w:t>Skill it demonstrates:</w:t>
-      </w:r>
-    </w:p>
-    <w:p>
-      <w:r>
-        <w:t>____________________________________________________</w:t>
-      </w:r>
-    </w:p>
-    <w:p>
-      <w:r>
-        <w:t>Evidence:</w:t>
-      </w:r>
-    </w:p>
-    <w:p>
-      <w:r>
-        <w:t>____________________________________________________</w:t>
-      </w:r>
-    </w:p>
-    <w:p>
-      <w:r>
-        <w:t>---</w:t>
-      </w:r>
-    </w:p>
-    <w:p>
-      <w:r>
-        <w:t>WEEK 5 · CAREER EXPLORATION</w:t>
-      </w:r>
-    </w:p>
-    <w:p>
-      <w:r>
-        <w:t>Something I researched, mapped or asked:</w:t>
-      </w:r>
-    </w:p>
-    <w:p>
-      <w:r>
-        <w:t>____________________________________________________</w:t>
-      </w:r>
-    </w:p>
-    <w:p>
-      <w:r>
-        <w:t>Skill it demonstrates:</w:t>
-      </w:r>
-    </w:p>
-    <w:p>
-      <w:r>
-        <w:t>____________________________________________________</w:t>
-      </w:r>
-    </w:p>
-    <w:p>
-      <w:r>
-        <w:t>Evidence:</w:t>
-      </w:r>
-    </w:p>
-    <w:p>
-      <w:r>
-        <w:t>____________________________________________________</w:t>
-      </w:r>
-    </w:p>
-    <w:p>
-      <w:r>
-        <w:t>---</w:t>
-      </w:r>
-    </w:p>
-    <w:p>
-      <w:r>
-        <w:t>WEEK 6 · $45,000 LIFE + MONEY</w:t>
-      </w:r>
-    </w:p>
-    <w:p>
-      <w:r>
-        <w:t>A decision or challenge I worked through:</w:t>
-      </w:r>
-    </w:p>
-    <w:p>
-      <w:r>
-        <w:t>____________________________________________________</w:t>
-      </w:r>
-    </w:p>
-    <w:p>
-      <w:r>
-        <w:t>Skill it demonstrates:</w:t>
-      </w:r>
-    </w:p>
-    <w:p>
-      <w:r>
-        <w:t>____________________________________________________</w:t>
-      </w:r>
-    </w:p>
-    <w:p>
-      <w:r>
-        <w:t>Evidence:</w:t>
-      </w:r>
-    </w:p>
-    <w:p>
-      <w:r>
-        <w:t>____________________________________________________</w:t>
-      </w:r>
-    </w:p>
-    <w:p>
-      <w:r>
-        <w:t>---</w:t>
-      </w:r>
-    </w:p>
-    <w:p>
-      <w:r>
-        <w:t>WEEK 7 · BRAD McMILLAN</w:t>
-      </w:r>
-    </w:p>
-    <w:p>
-      <w:r>
-        <w:t>A question, reflection or decision I made:</w:t>
-      </w:r>
-    </w:p>
-    <w:p>
-      <w:r>
-        <w:t>____________________________________________________</w:t>
-      </w:r>
-    </w:p>
-    <w:p>
-      <w:r>
-        <w:t>Skill it demonstrates:</w:t>
-      </w:r>
-    </w:p>
-    <w:p>
-      <w:r>
-        <w:t>____________________________________________________</w:t>
-      </w:r>
-    </w:p>
-    <w:p>
-      <w:r>
-        <w:t>Evidence:</w:t>
-      </w:r>
-    </w:p>
-    <w:p>
-      <w:r>
-        <w:t>____________________________________________________</w:t>
-      </w:r>
-    </w:p>
-    <w:p>
-      <w:r>
-        <w:t>---</w:t>
-      </w:r>
-    </w:p>
-    <w:p>
-      <w:r>
-        <w:t>WEEK 8 · TERRACON</w:t>
-      </w:r>
-    </w:p>
-    <w:p>
-      <w:r>
-        <w:t>Something I observed, investigated or connected:</w:t>
-      </w:r>
-    </w:p>
-    <w:p>
-      <w:r>
-        <w:t>____________________________________________________</w:t>
-      </w:r>
-    </w:p>
-    <w:p>
-      <w:r>
-        <w:t>Skill it demonstrates:</w:t>
-      </w:r>
-    </w:p>
-    <w:p>
-      <w:r>
-        <w:t>____________________________________________________</w:t>
-      </w:r>
-    </w:p>
-    <w:p>
-      <w:r>
-        <w:t>Evidence:</w:t>
-      </w:r>
-    </w:p>
-    <w:p>
-      <w:r>
-        <w:t>____________________________________________________</w:t>
-      </w:r>
-    </w:p>
-    <w:p>
-      <w:r>
-        <w:t>---</w:t>
-      </w:r>
-    </w:p>
-    <w:p>
-      <w:r>
-        <w:t>PART 3 · STOP USING EMPTY ADJECTIVES</w:t>
-      </w:r>
-    </w:p>
-    <w:p>
-      <w:r>
-        <w:t>Choose one word you might normally put on a resume.</w:t>
-      </w:r>
-    </w:p>
-    <w:p>
-      <w:r>
-        <w:t>[ ] Hardworking</w:t>
-      </w:r>
-    </w:p>
-    <w:p>
-      <w:r>
-        <w:t>[ ] Responsible</w:t>
-      </w:r>
-    </w:p>
-    <w:p>
-      <w:r>
-        <w:t>[ ] Leader</w:t>
-      </w:r>
-    </w:p>
-    <w:p>
-      <w:r>
-        <w:t>[ ] Team player</w:t>
-      </w:r>
-    </w:p>
-    <w:p>
-      <w:r>
-        <w:t>[ ] Organized</w:t>
-      </w:r>
-    </w:p>
-    <w:p>
-      <w:r>
-        <w:t>[ ] Good communicator</w:t>
-      </w:r>
-    </w:p>
-    <w:p>
-      <w:r>
-        <w:t>[ ] Problem solver</w:t>
-      </w:r>
-    </w:p>
-    <w:p>
-      <w:r>
-        <w:t>[ ] Reliable</w:t>
-      </w:r>
-    </w:p>
-    <w:p>
-      <w:r>
-        <w:t>[ ] Adaptable</w:t>
-      </w:r>
-    </w:p>
-    <w:p>
-      <w:r>
-        <w:t>[ ] Other: __________________________________________</w:t>
-      </w:r>
-    </w:p>
-    <w:p>
-      <w:r>
-        <w:t>Instead of saying:</w:t>
-      </w:r>
-    </w:p>
-    <w:p>
-      <w:r>
-        <w:t>I am _______________________________________________</w:t>
-      </w:r>
-    </w:p>
-    <w:p>
-      <w:r>
-        <w:t>Prove it.</w:t>
-      </w:r>
-    </w:p>
-    <w:p>
-      <w:r>
-        <w:t>What did you do?</w:t>
-      </w:r>
-    </w:p>
-    <w:p>
-      <w:r>
-        <w:t>____________________________________________________</w:t>
-      </w:r>
-    </w:p>
-    <w:p>
-      <w:r>
-        <w:t>Where?</w:t>
-      </w:r>
-    </w:p>
-    <w:p>
-      <w:r>
-        <w:t>____________________________________________________</w:t>
-      </w:r>
-    </w:p>
-    <w:p>
-      <w:r>
-        <w:t>What happened?</w:t>
-      </w:r>
-    </w:p>
-    <w:p>
-      <w:r>
-        <w:t>____________________________________________________</w:t>
-      </w:r>
-    </w:p>
-    <w:p>
-      <w:r>
-        <w:t>What changed because of your action?</w:t>
-      </w:r>
-    </w:p>
-    <w:p>
-      <w:r>
-        <w:t>____________________________________________________</w:t>
-      </w:r>
-    </w:p>
-    <w:p>
-      <w:r>
-        <w:t>---</w:t>
-      </w:r>
-    </w:p>
-    <w:p>
-      <w:r>
-        <w:t>PART 4 · ACTION + CONTEXT + RESULT</w:t>
-      </w:r>
-    </w:p>
-    <w:p>
-      <w:r>
-        <w:t>Use this structure:</w:t>
-      </w:r>
-    </w:p>
-    <w:p>
-      <w:r>
-        <w:t>**ACTION + CONTEXT + RESULT**</w:t>
-      </w:r>
-    </w:p>
-    <w:p>
-      <w:r>
-        <w:t>EXAMPLE</w:t>
-      </w:r>
-    </w:p>
-    <w:p>
-      <w:r>
-        <w:t>Weak:</w:t>
-      </w:r>
-    </w:p>
-    <w:p>
-      <w:r>
-        <w:t>“Good team player.”</w:t>
-      </w:r>
-    </w:p>
-    <w:p>
-      <w:r>
-        <w:t>Stronger:</w:t>
-      </w:r>
-    </w:p>
-    <w:p>
-      <w:r>
-        <w:t>“Collaborated with teammates during a high-pressure season while balancing academics and travel commitments.”</w:t>
-      </w:r>
-    </w:p>
-    <w:p>
-      <w:r>
-        <w:t>Stronger with result:</w:t>
-      </w:r>
-    </w:p>
-    <w:p>
-      <w:r>
-        <w:t>“Collaborated with teammates during a high-pressure season, adjusted roles when needed and helped maintain preparation through changing schedules.”</w:t>
-      </w:r>
-    </w:p>
-    <w:p>
-      <w:r>
-        <w:t>---</w:t>
-      </w:r>
-    </w:p>
-    <w:p>
-      <w:r>
-        <w:t>BUILD YOUR OWN</w:t>
-      </w:r>
-    </w:p>
-    <w:p>
-      <w:r>
-        <w:t>STORY 1</w:t>
-      </w:r>
-    </w:p>
-    <w:p>
-      <w:r>
-        <w:t>Action:</w:t>
-      </w:r>
-    </w:p>
-    <w:p>
-      <w:r>
-        <w:t>____________________________________________________</w:t>
-      </w:r>
-    </w:p>
-    <w:p>
-      <w:r>
-        <w:t>Context:</w:t>
-      </w:r>
-    </w:p>
-    <w:p>
-      <w:r>
-        <w:t>____________________________________________________</w:t>
-      </w:r>
-    </w:p>
-    <w:p>
-      <w:r>
-        <w:t>Result:</w:t>
-      </w:r>
-    </w:p>
-    <w:p>
-      <w:r>
-        <w:t>____________________________________________________</w:t>
-      </w:r>
-    </w:p>
-    <w:p>
-      <w:r>
-        <w:t>Resume-ready version:</w:t>
-      </w:r>
-    </w:p>
-    <w:p>
-      <w:r>
-        <w:t>____________________________________________________</w:t>
-      </w:r>
-    </w:p>
-    <w:p>
-      <w:r>
-        <w:t>____________________________________________________</w:t>
-      </w:r>
-    </w:p>
-    <w:p>
-      <w:r>
-        <w:t>---</w:t>
-      </w:r>
-    </w:p>
-    <w:p>
-      <w:r>
-        <w:t>STORY 2</w:t>
-      </w:r>
-    </w:p>
-    <w:p>
-      <w:r>
-        <w:t>Action:</w:t>
-      </w:r>
-    </w:p>
-    <w:p>
-      <w:r>
-        <w:t>____________________________________________________</w:t>
-      </w:r>
-    </w:p>
-    <w:p>
-      <w:r>
-        <w:t>Context:</w:t>
-      </w:r>
-    </w:p>
-    <w:p>
-      <w:r>
-        <w:t>____________________________________________________</w:t>
-      </w:r>
-    </w:p>
-    <w:p>
-      <w:r>
-        <w:t>Result:</w:t>
-      </w:r>
-    </w:p>
-    <w:p>
-      <w:r>
-        <w:t>____________________________________________________</w:t>
-      </w:r>
-    </w:p>
-    <w:p>
-      <w:r>
-        <w:t>Resume-ready version:</w:t>
-      </w:r>
-    </w:p>
-    <w:p>
-      <w:r>
-        <w:t>____________________________________________________</w:t>
-      </w:r>
-    </w:p>
-    <w:p>
-      <w:r>
-        <w:t>____________________________________________________</w:t>
-      </w:r>
-    </w:p>
-    <w:p>
-      <w:r>
-        <w:t>---</w:t>
-      </w:r>
-    </w:p>
-    <w:p>
-      <w:r>
-        <w:t>STORY 3</w:t>
-      </w:r>
-    </w:p>
-    <w:p>
-      <w:r>
-        <w:t>Action:</w:t>
-      </w:r>
-    </w:p>
-    <w:p>
-      <w:r>
-        <w:t>____________________________________________________</w:t>
-      </w:r>
-    </w:p>
-    <w:p>
-      <w:r>
-        <w:t>Context:</w:t>
-      </w:r>
-    </w:p>
-    <w:p>
-      <w:r>
-        <w:t>____________________________________________________</w:t>
-      </w:r>
-    </w:p>
-    <w:p>
-      <w:r>
-        <w:t>Result:</w:t>
-      </w:r>
-    </w:p>
-    <w:p>
-      <w:r>
-        <w:t>____________________________________________________</w:t>
-      </w:r>
-    </w:p>
-    <w:p>
-      <w:r>
-        <w:t>Resume-ready version:</w:t>
-      </w:r>
-    </w:p>
-    <w:p>
-      <w:r>
-        <w:t>____________________________________________________</w:t>
-      </w:r>
-    </w:p>
-    <w:p>
-      <w:r>
-        <w:t>____________________________________________________</w:t>
-      </w:r>
-    </w:p>
-    <w:p>
-      <w:r>
-        <w:t>---</w:t>
-      </w:r>
-    </w:p>
-    <w:p>
-      <w:r>
-        <w:t>STORY 4</w:t>
-      </w:r>
-    </w:p>
-    <w:p>
-      <w:r>
-        <w:t>Action:</w:t>
-      </w:r>
-    </w:p>
-    <w:p>
-      <w:r>
-        <w:t>____________________________________________________</w:t>
-      </w:r>
-    </w:p>
-    <w:p>
-      <w:r>
-        <w:t>Context:</w:t>
-      </w:r>
-    </w:p>
-    <w:p>
-      <w:r>
-        <w:t>____________________________________________________</w:t>
-      </w:r>
-    </w:p>
-    <w:p>
-      <w:r>
-        <w:t>Result:</w:t>
-      </w:r>
-    </w:p>
-    <w:p>
-      <w:r>
-        <w:t>____________________________________________________</w:t>
-      </w:r>
-    </w:p>
-    <w:p>
-      <w:r>
-        <w:t>Resume-ready version:</w:t>
-      </w:r>
-    </w:p>
-    <w:p>
-      <w:r>
-        <w:t>____________________________________________________</w:t>
-      </w:r>
-    </w:p>
-    <w:p>
-      <w:r>
-        <w:t>____________________________________________________</w:t>
-      </w:r>
-    </w:p>
-    <w:p>
-      <w:r>
-        <w:t>---</w:t>
-      </w:r>
-    </w:p>
-    <w:p>
-      <w:r>
-        <w:t>PART 5 · ATHLETICS INTO EMPLOYER LANGUAGE</w:t>
-      </w:r>
-    </w:p>
-    <w:p>
-      <w:r>
-        <w:t>Athletics can create strong evidence.</w:t>
-      </w:r>
-    </w:p>
-    <w:p>
-      <w:r>
-        <w:t>But employers need language that explains the transferable skill.</w:t>
-      </w:r>
-    </w:p>
-    <w:p>
-      <w:r>
-        <w:t>Athletic experience:</w:t>
-      </w:r>
-    </w:p>
-    <w:p>
-      <w:r>
-        <w:t>____________________________________________________</w:t>
-      </w:r>
-    </w:p>
-    <w:p>
-      <w:r>
-        <w:t>What actually happened?</w:t>
-      </w:r>
-    </w:p>
-    <w:p>
-      <w:r>
-        <w:t>____________________________________________________</w:t>
-      </w:r>
-    </w:p>
-    <w:p>
-      <w:r>
-        <w:t>____________________________________________________</w:t>
-      </w:r>
-    </w:p>
-    <w:p>
-      <w:r>
-        <w:t>What did I have to manage?</w:t>
-      </w:r>
-    </w:p>
-    <w:p>
-      <w:r>
-        <w:t>____________________________________________________</w:t>
-      </w:r>
-    </w:p>
-    <w:p>
-      <w:r>
-        <w:t>What skill did it require?</w:t>
-      </w:r>
-    </w:p>
-    <w:p>
-      <w:r>
-        <w:t>____________________________________________________</w:t>
-      </w:r>
-    </w:p>
-    <w:p>
-      <w:r>
-        <w:t>Translate it into employer language:</w:t>
-      </w:r>
-    </w:p>
-    <w:p>
-      <w:r>
-        <w:t>____________________________________________________</w:t>
-      </w:r>
-    </w:p>
-    <w:p>
-      <w:r>
-        <w:t>____________________________________________________</w:t>
-      </w:r>
-    </w:p>
-    <w:p>
-      <w:r>
-        <w:t>---</w:t>
-      </w:r>
-    </w:p>
-    <w:p>
-      <w:r>
-        <w:t>PART 6 · EXPERIENCE WITHOUT A FORMAL JOB</w:t>
-      </w:r>
-    </w:p>
-    <w:p>
-      <w:r>
-        <w:t>You do not need a traditional job title to have credible experience.</w:t>
-      </w:r>
-    </w:p>
-    <w:p>
-      <w:r>
-        <w:t>Consider:</w:t>
-      </w:r>
-    </w:p>
-    <w:p>
-      <w:r>
-        <w:t>- caring for siblings or family</w:t>
-        <w:br/>
-        <w:t>- transportation responsibilities</w:t>
-        <w:br/>
-        <w:t>- school projects</w:t>
-        <w:br/>
-        <w:t>- athletics</w:t>
-        <w:br/>
-        <w:t>- clubs</w:t>
-        <w:br/>
-        <w:t>- community service</w:t>
-        <w:br/>
-        <w:t>- church or youth groups</w:t>
-        <w:br/>
-        <w:t>- events</w:t>
-        <w:br/>
-        <w:t>- fundraising</w:t>
-        <w:br/>
-        <w:t>- leadership roles</w:t>
-        <w:br/>
-        <w:t>- personal projects</w:t>
-        <w:br/>
-        <w:t>- helping a family business</w:t>
-        <w:br/>
-        <w:t>- managing schedules</w:t>
-        <w:br/>
-        <w:t>- tutoring</w:t>
-        <w:br/>
-        <w:t>- organizing people or materials</w:t>
-      </w:r>
-    </w:p>
-    <w:p>
-      <w:r>
-        <w:t>One experience I usually overlook:</w:t>
-      </w:r>
-    </w:p>
-    <w:p>
-      <w:r>
-        <w:t>____________________________________________________</w:t>
-      </w:r>
-    </w:p>
-    <w:p>
-      <w:r>
-        <w:t>Responsibility involved:</w:t>
-      </w:r>
-    </w:p>
-    <w:p>
-      <w:r>
-        <w:t>____________________________________________________</w:t>
-      </w:r>
-    </w:p>
-    <w:p>
-      <w:r>
-        <w:t>Skill it demonstrates:</w:t>
-      </w:r>
-    </w:p>
-    <w:p>
-      <w:r>
-        <w:t>____________________________________________________</w:t>
-      </w:r>
-    </w:p>
-    <w:p>
-      <w:r>
-        <w:t>Resume-ready evidence:</w:t>
-      </w:r>
-    </w:p>
-    <w:p>
-      <w:r>
-        <w:t>____________________________________________________</w:t>
-      </w:r>
-    </w:p>
-    <w:p>
-      <w:r>
-        <w:t>____________________________________________________</w:t>
-      </w:r>
-    </w:p>
-    <w:p>
-      <w:r>
-        <w:t>---</w:t>
-      </w:r>
-    </w:p>
-    <w:p>
-      <w:r>
-        <w:t>PART 7 · THE FIVE-SECOND TEST</w:t>
-      </w:r>
-    </w:p>
-    <w:p>
-      <w:r>
-        <w:t>Imagine an employer looks at the top of your resume for five seconds.</w:t>
-      </w:r>
-    </w:p>
-    <w:p>
-      <w:r>
-        <w:t>What do you want them to remember?</w:t>
-      </w:r>
-    </w:p>
-    <w:p>
-      <w:r>
-        <w:t>____________________________________________________</w:t>
-      </w:r>
-    </w:p>
-    <w:p>
-      <w:r>
-        <w:t>____________________________________________________</w:t>
-      </w:r>
-    </w:p>
-    <w:p>
-      <w:r>
-        <w:t>What does your current resume actually communicate?</w:t>
-      </w:r>
-    </w:p>
-    <w:p>
-      <w:r>
-        <w:t>____________________________________________________</w:t>
-      </w:r>
-    </w:p>
-    <w:p>
-      <w:r>
-        <w:t>____________________________________________________</w:t>
-      </w:r>
-    </w:p>
-    <w:p>
-      <w:r>
-        <w:t>What is missing?</w:t>
-      </w:r>
-    </w:p>
-    <w:p>
-      <w:r>
-        <w:t>____________________________________________________</w:t>
-      </w:r>
-    </w:p>
-    <w:p>
-      <w:r>
-        <w:t>____________________________________________________</w:t>
-      </w:r>
-    </w:p>
-    <w:p>
-      <w:r>
-        <w:t>What feels generic?</w:t>
-      </w:r>
-    </w:p>
-    <w:p>
-      <w:r>
-        <w:t>____________________________________________________</w:t>
-      </w:r>
-    </w:p>
-    <w:p>
-      <w:r>
-        <w:t>____________________________________________________</w:t>
-      </w:r>
-    </w:p>
-    <w:p>
-      <w:r>
-        <w:t>What needs stronger evidence?</w:t>
-      </w:r>
-    </w:p>
-    <w:p>
-      <w:r>
-        <w:t>____________________________________________________</w:t>
-      </w:r>
-    </w:p>
-    <w:p>
-      <w:r>
-        <w:t>____________________________________________________</w:t>
-      </w:r>
-    </w:p>
-    <w:p>
-      <w:r>
-        <w:t>---</w:t>
-      </w:r>
-    </w:p>
-    <w:p>
-      <w:r>
-        <w:t>PART 8 · MY PROFESSIONAL STORY</w:t>
-      </w:r>
-    </w:p>
-    <w:p>
-      <w:r>
-        <w:t>Complete this without exaggerating.</w:t>
-      </w:r>
-    </w:p>
-    <w:p>
-      <w:r>
-        <w:t>I am someone who...</w:t>
-      </w:r>
-    </w:p>
-    <w:p>
-      <w:r>
-        <w:t>____________________________________________________</w:t>
-      </w:r>
-    </w:p>
-    <w:p>
-      <w:r>
-        <w:t>____________________________________________________</w:t>
-      </w:r>
-    </w:p>
-    <w:p>
-      <w:r>
-        <w:t>I have experience with...</w:t>
-      </w:r>
-    </w:p>
-    <w:p>
-      <w:r>
-        <w:t>____________________________________________________</w:t>
-      </w:r>
-    </w:p>
-    <w:p>
-      <w:r>
-        <w:t>____________________________________________________</w:t>
-      </w:r>
-    </w:p>
-    <w:p>
-      <w:r>
-        <w:t>I am strongest when...</w:t>
-      </w:r>
-    </w:p>
-    <w:p>
-      <w:r>
-        <w:t>____________________________________________________</w:t>
-      </w:r>
-    </w:p>
-    <w:p>
-      <w:r>
-        <w:t>____________________________________________________</w:t>
-      </w:r>
-    </w:p>
-    <w:p>
-      <w:r>
-        <w:t>People can count on me to...</w:t>
-      </w:r>
-    </w:p>
-    <w:p>
-      <w:r>
-        <w:t>____________________________________________________</w:t>
-      </w:r>
-    </w:p>
-    <w:p>
-      <w:r>
-        <w:t>____________________________________________________</w:t>
-      </w:r>
-    </w:p>
-    <w:p>
-      <w:r>
-        <w:t>I am currently building...</w:t>
-      </w:r>
-    </w:p>
-    <w:p>
-      <w:r>
-        <w:t>____________________________________________________</w:t>
-      </w:r>
-    </w:p>
-    <w:p>
-      <w:r>
-        <w:t>____________________________________________________</w:t>
-      </w:r>
-    </w:p>
-    <w:p>
-      <w:r>
-        <w:t>---</w:t>
-      </w:r>
-    </w:p>
-    <w:p>
-      <w:r>
-        <w:t>PART 9 · JENNIFER MILLER PREP</w:t>
-      </w:r>
-    </w:p>
-    <w:p>
-      <w:r>
-        <w:t>You will have the opportunity to learn from Jennifer Miller.</w:t>
-      </w:r>
-    </w:p>
-    <w:p>
-      <w:r>
-        <w:t>Use this experience to understand how professionals evaluate resumes, stories and young candidates.</w:t>
-      </w:r>
-    </w:p>
-    <w:p>
-      <w:r>
-        <w:t>Something I want Jennifer to explain about resumes:</w:t>
-      </w:r>
-    </w:p>
-    <w:p>
-      <w:r>
-        <w:t>____________________________________________________</w:t>
-      </w:r>
-    </w:p>
-    <w:p>
-      <w:r>
-        <w:t>____________________________________________________</w:t>
-      </w:r>
-    </w:p>
-    <w:p>
-      <w:r>
-        <w:t>Something I want to know about how employers read resumes:</w:t>
-      </w:r>
-    </w:p>
-    <w:p>
-      <w:r>
-        <w:t>____________________________________________________</w:t>
-      </w:r>
-    </w:p>
-    <w:p>
-      <w:r>
-        <w:t>____________________________________________________</w:t>
-      </w:r>
-    </w:p>
-    <w:p>
-      <w:r>
-        <w:t>Something I want to know about standing out without exaggerating:</w:t>
-      </w:r>
-    </w:p>
-    <w:p>
-      <w:r>
-        <w:t>____________________________________________________</w:t>
-      </w:r>
-    </w:p>
-    <w:p>
-      <w:r>
-        <w:t>____________________________________________________</w:t>
-      </w:r>
-    </w:p>
-    <w:p>
-      <w:r>
-        <w:t>Something I want to know about experience when someone is young:</w:t>
-      </w:r>
-    </w:p>
-    <w:p>
-      <w:r>
-        <w:t>____________________________________________________</w:t>
-      </w:r>
-    </w:p>
-    <w:p>
-      <w:r>
-        <w:t>____________________________________________________</w:t>
-      </w:r>
-    </w:p>
-    <w:p>
-      <w:r>
-        <w:t>---</w:t>
-      </w:r>
-    </w:p>
-    <w:p>
-      <w:r>
-        <w:t>MY QUESTIONS FOR JENNIFER</w:t>
-      </w:r>
-    </w:p>
-    <w:p>
-      <w:r>
-        <w:t>QUESTION 1</w:t>
-      </w:r>
-    </w:p>
-    <w:p>
-      <w:r>
-        <w:t>____________________________________________________</w:t>
-      </w:r>
-    </w:p>
-    <w:p>
-      <w:r>
-        <w:t>Why does this matter to me?</w:t>
-      </w:r>
-    </w:p>
-    <w:p>
-      <w:r>
-        <w:t>____________________________________________________</w:t>
-      </w:r>
-    </w:p>
-    <w:p>
-      <w:r>
-        <w:t>---</w:t>
-      </w:r>
-    </w:p>
-    <w:p>
-      <w:r>
-        <w:t>QUESTION 2</w:t>
-      </w:r>
-    </w:p>
-    <w:p>
-      <w:r>
-        <w:t>____________________________________________________</w:t>
-      </w:r>
-    </w:p>
-    <w:p>
-      <w:r>
-        <w:t>Why does this matter to me?</w:t>
-      </w:r>
-    </w:p>
-    <w:p>
-      <w:r>
-        <w:t>____________________________________________________</w:t>
-      </w:r>
-    </w:p>
-    <w:p>
-      <w:r>
-        <w:t>---</w:t>
-      </w:r>
-    </w:p>
-    <w:p>
-      <w:r>
-        <w:t>QUESTION 3</w:t>
-      </w:r>
-    </w:p>
-    <w:p>
-      <w:r>
-        <w:t>____________________________________________________</w:t>
-      </w:r>
-    </w:p>
-    <w:p>
-      <w:r>
-        <w:t>Why does this matter to me?</w:t>
-      </w:r>
-    </w:p>
-    <w:p>
-      <w:r>
-        <w:t>____________________________________________________</w:t>
-      </w:r>
-    </w:p>
-    <w:p>
-      <w:r>
-        <w:t>---</w:t>
-      </w:r>
-    </w:p>
-    <w:p>
-      <w:r>
-        <w:t>PART 10 · DURING THE CONVERSATION</w:t>
-      </w:r>
-    </w:p>
-    <w:p>
-      <w:r>
-        <w:t>One thing Jennifer says employers notice quickly:</w:t>
-      </w:r>
-    </w:p>
-    <w:p>
-      <w:r>
-        <w:t>____________________________________________________</w:t>
-      </w:r>
-    </w:p>
-    <w:p>
-      <w:r>
-        <w:t>____________________________________________________</w:t>
-      </w:r>
-    </w:p>
-    <w:p>
-      <w:r>
-        <w:t>One resume mistake to avoid:</w:t>
-      </w:r>
-    </w:p>
-    <w:p>
-      <w:r>
-        <w:t>____________________________________________________</w:t>
-      </w:r>
-    </w:p>
-    <w:p>
-      <w:r>
-        <w:t>____________________________________________________</w:t>
-      </w:r>
-    </w:p>
-    <w:p>
-      <w:r>
-        <w:t>One way to make experience more credible:</w:t>
-      </w:r>
-    </w:p>
-    <w:p>
-      <w:r>
-        <w:t>____________________________________________________</w:t>
-      </w:r>
-    </w:p>
-    <w:p>
-      <w:r>
-        <w:t>____________________________________________________</w:t>
-      </w:r>
-    </w:p>
-    <w:p>
-      <w:r>
-        <w:t>One thing young candidates often underestimate:</w:t>
-      </w:r>
-    </w:p>
-    <w:p>
-      <w:r>
-        <w:t>____________________________________________________</w:t>
-      </w:r>
-    </w:p>
-    <w:p>
-      <w:r>
-        <w:t>____________________________________________________</w:t>
-      </w:r>
-    </w:p>
-    <w:p>
-      <w:r>
-        <w:t>One piece of advice I want to use:</w:t>
-      </w:r>
-    </w:p>
-    <w:p>
-      <w:r>
-        <w:t>____________________________________________________</w:t>
-      </w:r>
-    </w:p>
-    <w:p>
-      <w:r>
-        <w:t>____________________________________________________</w:t>
-      </w:r>
-    </w:p>
-    <w:p>
-      <w:r>
-        <w:t>---</w:t>
-      </w:r>
-    </w:p>
-    <w:p>
-      <w:r>
-        <w:t>PART 11 · APPLY THE FEEDBACK</w:t>
-      </w:r>
-    </w:p>
-    <w:p>
-      <w:r>
-        <w:t>Choose one section of your resume or professional profile.</w:t>
-      </w:r>
-    </w:p>
-    <w:p>
-      <w:r>
-        <w:t>BEFORE</w:t>
-      </w:r>
-    </w:p>
-    <w:p>
-      <w:r>
-        <w:t>____________________________________________________</w:t>
-      </w:r>
-    </w:p>
-    <w:p>
-      <w:r>
-        <w:t>____________________________________________________</w:t>
-      </w:r>
-    </w:p>
-    <w:p>
-      <w:r>
-        <w:t>WHAT NEEDED TO CHANGE</w:t>
-      </w:r>
-    </w:p>
-    <w:p>
-      <w:r>
-        <w:t>____________________________________________________</w:t>
-      </w:r>
-    </w:p>
-    <w:p>
-      <w:r>
-        <w:t>____________________________________________________</w:t>
-      </w:r>
-    </w:p>
-    <w:p>
-      <w:r>
-        <w:t>AFTER</w:t>
-      </w:r>
-    </w:p>
-    <w:p>
-      <w:r>
-        <w:t>____________________________________________________</w:t>
-      </w:r>
-    </w:p>
-    <w:p>
-      <w:r>
-        <w:t>____________________________________________________</w:t>
-      </w:r>
-    </w:p>
-    <w:p>
-      <w:r>
-        <w:t>Why is the revised version stronger?</w:t>
-      </w:r>
-    </w:p>
-    <w:p>
-      <w:r>
-        <w:t>____________________________________________________</w:t>
-      </w:r>
-    </w:p>
-    <w:p>
-      <w:r>
-        <w:t>____________________________________________________</w:t>
-      </w:r>
-    </w:p>
-    <w:p>
-      <w:r>
-        <w:t>---</w:t>
-      </w:r>
-    </w:p>
-    <w:p>
-      <w:r>
-        <w:t>PART 12 · MY STORY BANK</w:t>
-      </w:r>
-    </w:p>
-    <w:p>
-      <w:r>
-        <w:t>Create a bank of stories you can later use for resumes, interviews, networking and applications.</w:t>
-      </w:r>
-    </w:p>
-    <w:p>
-      <w:r>
-        <w:t>STORY A · TEAMWORK</w:t>
-      </w:r>
-    </w:p>
-    <w:p>
-      <w:r>
-        <w:t>Situation:</w:t>
-      </w:r>
-    </w:p>
-    <w:p>
-      <w:r>
-        <w:t>____________________________________________________</w:t>
-      </w:r>
-    </w:p>
-    <w:p>
-      <w:r>
-        <w:t>What I did:</w:t>
-      </w:r>
-    </w:p>
-    <w:p>
-      <w:r>
-        <w:t>____________________________________________________</w:t>
-      </w:r>
-    </w:p>
-    <w:p>
-      <w:r>
-        <w:t>Result:</w:t>
-      </w:r>
-    </w:p>
-    <w:p>
-      <w:r>
-        <w:t>____________________________________________________</w:t>
-      </w:r>
-    </w:p>
-    <w:p>
-      <w:r>
-        <w:t>---</w:t>
-      </w:r>
-    </w:p>
-    <w:p>
-      <w:r>
-        <w:t>STORY B · LEADERSHIP</w:t>
-      </w:r>
-    </w:p>
-    <w:p>
-      <w:r>
-        <w:t>Situation:</w:t>
-      </w:r>
-    </w:p>
-    <w:p>
-      <w:r>
-        <w:t>____________________________________________________</w:t>
-      </w:r>
-    </w:p>
-    <w:p>
-      <w:r>
-        <w:t>What I did:</w:t>
-      </w:r>
-    </w:p>
-    <w:p>
-      <w:r>
-        <w:t>____________________________________________________</w:t>
-      </w:r>
-    </w:p>
-    <w:p>
-      <w:r>
-        <w:t>Result:</w:t>
-      </w:r>
-    </w:p>
-    <w:p>
-      <w:r>
-        <w:t>____________________________________________________</w:t>
-      </w:r>
-    </w:p>
-    <w:p>
-      <w:r>
-        <w:t>---</w:t>
-      </w:r>
-    </w:p>
-    <w:p>
-      <w:r>
-        <w:t>STORY C · PROBLEM SOLVING</w:t>
-      </w:r>
-    </w:p>
-    <w:p>
-      <w:r>
-        <w:t>Situation:</w:t>
-      </w:r>
-    </w:p>
-    <w:p>
-      <w:r>
-        <w:t>____________________________________________________</w:t>
-      </w:r>
-    </w:p>
-    <w:p>
-      <w:r>
-        <w:t>What I did:</w:t>
-      </w:r>
-    </w:p>
-    <w:p>
-      <w:r>
-        <w:t>____________________________________________________</w:t>
-      </w:r>
-    </w:p>
-    <w:p>
-      <w:r>
-        <w:t>Result:</w:t>
-      </w:r>
-    </w:p>
-    <w:p>
-      <w:r>
-        <w:t>____________________________________________________</w:t>
-      </w:r>
-    </w:p>
-    <w:p>
-      <w:r>
-        <w:t>---</w:t>
-      </w:r>
-    </w:p>
-    <w:p>
-      <w:r>
-        <w:t>STORY D · RELIABILITY</w:t>
-      </w:r>
-    </w:p>
-    <w:p>
-      <w:r>
-        <w:t>Situation:</w:t>
-      </w:r>
-    </w:p>
-    <w:p>
-      <w:r>
-        <w:t>____________________________________________________</w:t>
-      </w:r>
-    </w:p>
-    <w:p>
-      <w:r>
-        <w:t>What I did:</w:t>
-      </w:r>
-    </w:p>
-    <w:p>
-      <w:r>
-        <w:t>____________________________________________________</w:t>
-      </w:r>
-    </w:p>
-    <w:p>
-      <w:r>
-        <w:t>Result:</w:t>
-      </w:r>
-    </w:p>
-    <w:p>
-      <w:r>
-        <w:t>____________________________________________________</w:t>
-      </w:r>
-    </w:p>
-    <w:p>
-      <w:r>
-        <w:t>---</w:t>
-      </w:r>
-    </w:p>
-    <w:p>
-      <w:r>
-        <w:t>STORY E · ADAPTABILITY</w:t>
-      </w:r>
-    </w:p>
-    <w:p>
-      <w:r>
-        <w:t>Situation:</w:t>
-      </w:r>
-    </w:p>
-    <w:p>
-      <w:r>
-        <w:t>____________________________________________________</w:t>
-      </w:r>
-    </w:p>
-    <w:p>
-      <w:r>
-        <w:t>What I did:</w:t>
-      </w:r>
-    </w:p>
-    <w:p>
-      <w:r>
-        <w:t>____________________________________________________</w:t>
-      </w:r>
-    </w:p>
-    <w:p>
-      <w:r>
-        <w:t>Result:</w:t>
-      </w:r>
-    </w:p>
-    <w:p>
-      <w:r>
-        <w:t>____________________________________________________</w:t>
-      </w:r>
-    </w:p>
-    <w:p>
-      <w:r>
-        <w:t>---</w:t>
-      </w:r>
-    </w:p>
-    <w:p>
-      <w:r>
-        <w:t>STORY F · COMMUNICATION</w:t>
-      </w:r>
-    </w:p>
-    <w:p>
-      <w:r>
-        <w:t>Situation:</w:t>
-      </w:r>
-    </w:p>
-    <w:p>
-      <w:r>
-        <w:t>____________________________________________________</w:t>
-      </w:r>
-    </w:p>
-    <w:p>
-      <w:r>
-        <w:t>What I did:</w:t>
-      </w:r>
-    </w:p>
-    <w:p>
-      <w:r>
-        <w:t>____________________________________________________</w:t>
-      </w:r>
-    </w:p>
-    <w:p>
-      <w:r>
-        <w:t>Result:</w:t>
-      </w:r>
-    </w:p>
-    <w:p>
-      <w:r>
-        <w:t>____________________________________________________</w:t>
-      </w:r>
-    </w:p>
-    <w:p>
-      <w:r>
-        <w:t>---</w:t>
-      </w:r>
-    </w:p>
-    <w:p>
-      <w:r>
-        <w:t>PROFESSIONAL FOLLOW-UP</w:t>
-      </w:r>
-    </w:p>
-    <w:p>
-      <w:r>
-        <w:t>One specific thing I could thank Jennifer for:</w:t>
-      </w:r>
-    </w:p>
-    <w:p>
-      <w:r>
-        <w:t>____________________________________________________</w:t>
-      </w:r>
-    </w:p>
-    <w:p>
-      <w:r>
-        <w:t>____________________________________________________</w:t>
-      </w:r>
-    </w:p>
-    <w:p>
-      <w:r>
-        <w:t>One piece of advice I could mention:</w:t>
-      </w:r>
-    </w:p>
-    <w:p>
-      <w:r>
-        <w:t>____________________________________________________</w:t>
-      </w:r>
-    </w:p>
-    <w:p>
-      <w:r>
-        <w:t>____________________________________________________</w:t>
-      </w:r>
-    </w:p>
-    <w:p>
-      <w:r>
-        <w:t>One change I made because of the conversation:</w:t>
-      </w:r>
-    </w:p>
-    <w:p>
-      <w:r>
-        <w:t>____________________________________________________</w:t>
-      </w:r>
-    </w:p>
-    <w:p>
-      <w:r>
-        <w:t>____________________________________________________</w:t>
-      </w:r>
-    </w:p>
-    <w:p>
-      <w:r>
-        <w:t>---</w:t>
-      </w:r>
-    </w:p>
-    <w:p>
-      <w:r>
-        <w:t>WEEK 9 REFLECTION</w:t>
-      </w:r>
-    </w:p>
-    <w:p>
-      <w:r>
-        <w:t>BEFORE THIS WEEK...</w:t>
-      </w:r>
-    </w:p>
-    <w:p>
-      <w:r>
-        <w:t>I thought a strong resume was mostly about:</w:t>
-      </w:r>
-    </w:p>
-    <w:p>
-      <w:r>
-        <w:t>____________________________________________________</w:t>
-      </w:r>
-    </w:p>
-    <w:p>
-      <w:r>
-        <w:t>____________________________________________________</w:t>
-      </w:r>
-    </w:p>
-    <w:p>
-      <w:r>
-        <w:t>NOW...</w:t>
-      </w:r>
-    </w:p>
-    <w:p>
-      <w:r>
-        <w:t>I understand a strong resume needs:</w:t>
-      </w:r>
-    </w:p>
-    <w:p>
-      <w:r>
-        <w:t>____________________________________________________</w:t>
-      </w:r>
-    </w:p>
-    <w:p>
-      <w:r>
-        <w:t>____________________________________________________</w:t>
-      </w:r>
-    </w:p>
-    <w:p>
-      <w:r>
-        <w:t>The strongest evidence I found about myself:</w:t>
-      </w:r>
-    </w:p>
-    <w:p>
-      <w:r>
-        <w:t>____________________________________________________</w:t>
-      </w:r>
-    </w:p>
-    <w:p>
-      <w:r>
-        <w:t>The experience I was underestimating:</w:t>
-      </w:r>
-    </w:p>
-    <w:p>
-      <w:r>
-        <w:t>____________________________________________________</w:t>
-      </w:r>
-    </w:p>
-    <w:p>
-      <w:r>
-        <w:t>The skill I can now prove better:</w:t>
-      </w:r>
-    </w:p>
-    <w:p>
-      <w:r>
-        <w:t>____________________________________________________</w:t>
-      </w:r>
-    </w:p>
-    <w:p>
-      <w:r>
-        <w:t>The resume change I am most confident about:</w:t>
-      </w:r>
-    </w:p>
-    <w:p>
-      <w:r>
-        <w:t>____________________________________________________</w:t>
-      </w:r>
-    </w:p>
-    <w:p>
-      <w:r>
-        <w:t>The professional story I want to keep developing:</w:t>
-      </w:r>
-    </w:p>
-    <w:p>
-      <w:r>
-        <w:t>____________________________________________________</w:t>
-      </w:r>
-    </w:p>
-    <w:p>
-      <w:r>
-        <w:t>---</w:t>
-      </w:r>
-    </w:p>
-    <w:p>
-      <w:r>
-        <w:t>FUTURE READY™ PASSPORT EVIDENCE</w:t>
-      </w:r>
-    </w:p>
-    <w:p>
-      <w:r>
-        <w:t>Save:</w:t>
-      </w:r>
-    </w:p>
-    <w:p>
-      <w:r>
-        <w:t>ONE EXPERIENCE-TO-SKILL STATEMENT</w:t>
-      </w:r>
-    </w:p>
-    <w:p>
-      <w:r>
-        <w:t>____________________________________________________</w:t>
-      </w:r>
-    </w:p>
-    <w:p>
-      <w:r>
-        <w:t>ONE RESUME-READY BULLET</w:t>
-      </w:r>
-    </w:p>
-    <w:p>
-      <w:r>
-        <w:t>____________________________________________________</w:t>
-      </w:r>
-    </w:p>
-    <w:p>
-      <w:r>
-        <w:t>ONE STORY FROM ATHLETICS, SCHOOL, WORK OR LIFE</w:t>
-      </w:r>
-    </w:p>
-    <w:p>
-      <w:r>
-        <w:t>____________________________________________________</w:t>
-      </w:r>
-    </w:p>
-    <w:p>
-      <w:r>
-        <w:t>ONE REVISED PROFESSIONAL STATEMENT</w:t>
-      </w:r>
-    </w:p>
-    <w:p>
-      <w:r>
-        <w:t>____________________________________________________</w:t>
-      </w:r>
-    </w:p>
-    <w:p>
-      <w:r>
-        <w:t>ONE PIECE OF JENNIFER'S FEEDBACK</w:t>
-      </w:r>
-    </w:p>
-    <w:p>
-      <w:r>
-        <w:t>____________________________________________________</w:t>
-      </w:r>
-    </w:p>
-    <w:p>
-      <w:r>
-        <w:t>ONE CHANGE I MADE</w:t>
-      </w:r>
-    </w:p>
-    <w:p>
-      <w:r>
-        <w:t>____________________________________________________</w:t>
-      </w:r>
-    </w:p>
-    <w:p>
-      <w:r>
-        <w:t>---</w:t>
-      </w:r>
-    </w:p>
-    <w:p>
-      <w:r>
-        <w:t>CAPSTONE CONNECTION</w:t>
-      </w:r>
-    </w:p>
-    <w:p>
-      <w:r>
-        <w:t>Keep:</w:t>
-      </w:r>
-    </w:p>
-    <w:p>
-      <w:r>
-        <w:t>- your strongest resume-ready statement</w:t>
-        <w:br/>
-        <w:t>- one story that proves a human skill</w:t>
-        <w:br/>
-        <w:t>- one story that shows problem solving</w:t>
-        <w:br/>
-        <w:t>- one experience you originally underestimated</w:t>
-        <w:br/>
-        <w:t>- one professional who helped sharpen your thinking</w:t>
-        <w:br/>
-        <w:t>- one piece of feedback that changed your professional materials</w:t>
-        <w:br/>
-        <w:t>- one example of how you can now explain your value more clearly</w:t>
-      </w:r>
-    </w:p>
-    <w:p>
-      <w:r>
-        <w:t>Your resume is not your entire story.</w:t>
-      </w:r>
-    </w:p>
-    <w:p>
-      <w:r>
-        <w:t>It is evidence that gives someone a reason to ask you for more of the story.</w:t>
-      </w:r>
-    </w:p>
-    <w:p>
-      <w:r>
-        <w:t>---</w:t>
-      </w:r>
-    </w:p>
-    <w:p>
-      <w:r>
-        <w:t>WEEK 9 CLOSE</w:t>
-      </w:r>
-    </w:p>
-    <w:p>
-      <w:r>
-        <w:t>I USED TO SAY...</w:t>
-      </w:r>
-    </w:p>
-    <w:p>
-      <w:r>
-        <w:t>____________________________________________________</w:t>
-      </w:r>
-    </w:p>
-    <w:p>
-      <w:r>
-        <w:t>NOW I CAN PROVE...</w:t>
-      </w:r>
-    </w:p>
-    <w:p>
-      <w:r>
-        <w:t>____________________________________________________</w:t>
-      </w:r>
-    </w:p>
-    <w:p>
-      <w:r>
-        <w:t>THE EXPERIENCE I WILL NOT OVERLOOK AGAIN...</w:t>
-      </w:r>
-    </w:p>
-    <w:p>
-      <w:r>
-        <w:t>____________________________________________________</w:t>
-      </w:r>
-    </w:p>
-    <w:p>
-      <w:r>
-        <w:t>THE FEEDBACK I WILL USE...</w:t>
-      </w:r>
-    </w:p>
-    <w:p>
-      <w:r>
-        <w:t>____________________________________________________</w:t>
-      </w:r>
-    </w:p>
-    <w:p>
-      <w:r>
-        <w:t>THE STORY I CAN NOW TELL...</w:t>
-      </w:r>
-    </w:p>
-    <w:p>
-      <w:r>
-        <w:t>____________________________________________________</w:t>
-      </w:r>
-    </w:p>
-    <w:p>
-      <w:r>
-        <w:t>THE NEXT THING I WILL IMPROVE...</w:t>
-      </w:r>
-    </w:p>
-    <w:p>
-      <w:r>
-        <w:t>____________________________________________________</w:t>
-      </w:r>
-    </w:p>
-    <w:p>
-      <w:r>
-        <w:t>---</w:t>
-      </w:r>
-    </w:p>
-    <w:p>
-      <w:r>
-        <w:t>**DON'T JUST CLAIM THE SKILL. PROVE IT.**</w:t>
-      </w:r>
-    </w:p>
-    <w:p>
-      <w:r>
-        <w:t>© 2026 BUILD6™. All Rights Reserved.</w:t>
-      </w:r>
-    </w:p>
-    <w:p>
-      <w:r>
-        <w:t>Proprietary Future Ready™ / BUILD6™ program material.</w:t>
+        <w:t>Preserve one example showing how you used judgment: the original AI output, what you changed or rejected, what you verified, and why your final decision was better.</w:t>
       </w:r>
     </w:p>
     <w:sectPr>
-      <w:footerReference w:type="default" r:id="rId9"/>
       <w:pgSz w:w="12240" w:h="15840"/>
-      <w:pgMar w:top="1008" w:right="1008" w:bottom="1008" w:left="1008" w:header="720" w:footer="720" w:gutter="0"/>
+      <w:pgMar w:top="792" w:right="936" w:bottom="792" w:left="936" w:header="720" w:footer="720" w:gutter="0"/>
       <w:cols w:space="720"/>
       <w:docGrid w:linePitch="360"/>
     </w:sectPr>
   </w:body>
 </w:document>
-</file>
-
-<file path=word/footer1.xml><?xml version="1.0" encoding="utf-8"?>
-<w:ftr xmlns:m="http://schemas.openxmlformats.org/officeDocument/2006/math" xmlns:mc="http://schemas.openxmlformats.org/markup-compatibility/2006" xmlns:mo="http://schemas.microsoft.com/office/mac/office/2008/main" xmlns:mv="urn:schemas-microsoft-com:mac:vml" xmlns:o="urn:schemas-microsoft-com:office:office" xmlns:r="http://schemas.openxmlformats.org/officeDocument/2006/relationships" xmlns:v="urn:schemas-microsoft-com:vml" xmlns:w10="urn:schemas-microsoft-com:office:word" xmlns:w14="http://schemas.microsoft.com/office/word/2010/wordml" xmlns:w="http://schemas.openxmlformats.org/wordprocessingml/2006/main" xmlns:wne="http://schemas.microsoft.com/office/word/2006/wordml" xmlns:wp14="http://schemas.microsoft.com/office/word/2010/wordprocessingDrawing" xmlns:wp="http://schemas.openxmlformats.org/drawingml/2006/wordprocessingDrawing" xmlns:wpc="http://schemas.microsoft.com/office/word/2010/wordprocessingCanvas" xmlns:wpg="http://schemas.microsoft.com/office/word/2010/wordprocessingGroup" xmlns:wpi="http://schemas.microsoft.com/office/word/2010/wordprocessingInk" xmlns:wps="http://schemas.microsoft.com/office/word/2010/wordprocessingShape" mc:Ignorable="w14 wp14">
-  <w:p>
-    <w:pPr>
-      <w:pStyle w:val="Footer"/>
-    </w:pPr>
-    <w:r>
-      <w:t>BUILD6™ — Proprietary curriculum of LINK Lake Norman, LLC. Do not reproduce without permission.</w:t>
-    </w:r>
-  </w:p>
-</w:ftr>
 </file>
 
 <file path=word/numbering.xml><?xml version="1.0" encoding="utf-8"?>
@@ -2877,6 +995,10 @@
     <w:name w:val="Normal"/>
     <w:qFormat/>
     <w:rsid w:val="00FC693F"/>
+    <w:rPr>
+      <w:rFonts w:ascii="Aptos" w:hAnsi="Aptos"/>
+      <w:sz w:val="21"/>
+    </w:rPr>
   </w:style>
   <w:style w:type="paragraph" w:styleId="Header">
     <w:name w:val="header"/>
@@ -2937,11 +1059,11 @@
       <w:outlineLvl w:val="0"/>
     </w:pPr>
     <w:rPr>
-      <w:rFonts w:asciiTheme="majorHAnsi" w:eastAsiaTheme="majorEastAsia" w:hAnsiTheme="majorHAnsi" w:cstheme="majorBidi"/>
+      <w:rFonts w:asciiTheme="majorHAnsi" w:eastAsiaTheme="majorEastAsia" w:hAnsiTheme="majorHAnsi" w:cstheme="majorBidi" w:ascii="Aptos" w:hAnsi="Aptos"/>
       <w:b/>
       <w:bCs/>
       <w:color w:val="365F91" w:themeColor="accent1" w:themeShade="BF"/>
-      <w:sz w:val="28"/>
+      <w:sz w:val="36"/>
       <w:szCs w:val="28"/>
     </w:rPr>
   </w:style>
@@ -2961,7 +1083,7 @@
       <w:outlineLvl w:val="1"/>
     </w:pPr>
     <w:rPr>
-      <w:rFonts w:asciiTheme="majorHAnsi" w:eastAsiaTheme="majorEastAsia" w:hAnsiTheme="majorHAnsi" w:cstheme="majorBidi"/>
+      <w:rFonts w:asciiTheme="majorHAnsi" w:eastAsiaTheme="majorEastAsia" w:hAnsiTheme="majorHAnsi" w:cstheme="majorBidi" w:ascii="Aptos" w:hAnsi="Aptos"/>
       <w:b/>
       <w:bCs/>
       <w:color w:val="4F81BD" w:themeColor="accent1"/>
@@ -2985,10 +1107,11 @@
       <w:outlineLvl w:val="2"/>
     </w:pPr>
     <w:rPr>
-      <w:rFonts w:asciiTheme="majorHAnsi" w:eastAsiaTheme="majorEastAsia" w:hAnsiTheme="majorHAnsi" w:cstheme="majorBidi"/>
+      <w:rFonts w:asciiTheme="majorHAnsi" w:eastAsiaTheme="majorEastAsia" w:hAnsiTheme="majorHAnsi" w:cstheme="majorBidi" w:ascii="Aptos" w:hAnsi="Aptos"/>
       <w:b/>
       <w:bCs/>
       <w:color w:val="4F81BD" w:themeColor="accent1"/>
+      <w:sz w:val="22"/>
     </w:rPr>
   </w:style>
   <w:style w:type="paragraph" w:styleId="Heading4">
@@ -3226,7 +1349,8 @@
       <w:contextualSpacing/>
     </w:pPr>
     <w:rPr>
-      <w:rFonts w:asciiTheme="majorHAnsi" w:eastAsiaTheme="majorEastAsia" w:hAnsiTheme="majorHAnsi" w:cstheme="majorBidi"/>
+      <w:rFonts w:asciiTheme="majorHAnsi" w:eastAsiaTheme="majorEastAsia" w:hAnsiTheme="majorHAnsi" w:cstheme="majorBidi" w:ascii="Aptos" w:hAnsi="Aptos"/>
+      <w:b/>
       <w:color w:val="17365D" w:themeColor="text2" w:themeShade="BF"/>
       <w:spacing w:val="5"/>
       <w:kern w:val="28"/>

</xml_diff>